<commit_message>
add gost to tz
</commit_message>
<xml_diff>
--- a/docs/tz.docx
+++ b/docs/tz.docx
@@ -6099,6 +6099,26 @@
       </w:r>
     </w:p>
     <w:p>
+      <w:r>
+        <w:t xml:space="preserve">– </w:t>
+      </w:r>
+      <w:r>
+        <w:t>ГОСТ 18123-82 «Шайбы. Общие технические условия»</w:t>
+      </w:r>
+      <w:r>
+        <w:t xml:space="preserve"> </w:t>
+      </w:r>
+      <w:r>
+        <w:rPr>
+          <w:lang w:val="en-US"/>
+        </w:rPr>
+        <w:t>[5]</w:t>
+      </w:r>
+      <w:r>
+        <w:t>.</w:t>
+      </w:r>
+    </w:p>
+    <w:p>
       <w:pPr>
         <w:ind w:firstLine="0"/>
       </w:pPr>
@@ -6501,6 +6521,27 @@
       </w:pPr>
       <w:r>
         <w:t xml:space="preserve">ОС ТУСУР 01-2021 «Работы студенческие по направлениям подготовки и специальностям технического профиля. Общие требования и правила оформления от 25.11.2021»; </w:t>
+      </w:r>
+    </w:p>
+    <w:p>
+      <w:pPr>
+        <w:numPr>
+          <w:ilvl w:val="0"/>
+          <w:numId w:val="8"/>
+        </w:numPr>
+        <w:ind w:firstLine="709"/>
+      </w:pPr>
+      <w:r>
+        <w:t xml:space="preserve"> </w:t>
+      </w:r>
+      <w:r>
+        <w:t xml:space="preserve">ГОСТ </w:t>
+      </w:r>
+      <w:r>
+        <w:t>18123-82 «Шайбы. Общие технические условия</w:t>
+      </w:r>
+      <w:r>
+        <w:t>».</w:t>
       </w:r>
     </w:p>
     <w:p>
@@ -7187,6 +7228,155 @@
     </w:lvl>
   </w:abstractNum>
   <w:abstractNum w:abstractNumId="6" w15:restartNumberingAfterBreak="0">
+    <w:nsid w:val="3C746696"/>
+    <w:multiLevelType w:val="multilevel"/>
+    <w:tmpl w:val="BEE86DE6"/>
+    <w:lvl w:ilvl="0">
+      <w:start w:val="1"/>
+      <w:numFmt w:val="bullet"/>
+      <w:lvlText w:val=""/>
+      <w:lvlJc w:val="left"/>
+      <w:pPr>
+        <w:tabs>
+          <w:tab w:val="num" w:pos="720"/>
+        </w:tabs>
+        <w:ind w:left="720" w:hanging="360"/>
+      </w:pPr>
+      <w:rPr>
+        <w:rFonts w:ascii="Symbol" w:hAnsi="Symbol" w:hint="default"/>
+        <w:sz w:val="20"/>
+      </w:rPr>
+    </w:lvl>
+    <w:lvl w:ilvl="1" w:tentative="1">
+      <w:start w:val="1"/>
+      <w:numFmt w:val="bullet"/>
+      <w:lvlText w:val="o"/>
+      <w:lvlJc w:val="left"/>
+      <w:pPr>
+        <w:tabs>
+          <w:tab w:val="num" w:pos="1440"/>
+        </w:tabs>
+        <w:ind w:left="1440" w:hanging="360"/>
+      </w:pPr>
+      <w:rPr>
+        <w:rFonts w:ascii="Courier New" w:hAnsi="Courier New" w:hint="default"/>
+        <w:sz w:val="20"/>
+      </w:rPr>
+    </w:lvl>
+    <w:lvl w:ilvl="2" w:tentative="1">
+      <w:start w:val="1"/>
+      <w:numFmt w:val="bullet"/>
+      <w:lvlText w:val=""/>
+      <w:lvlJc w:val="left"/>
+      <w:pPr>
+        <w:tabs>
+          <w:tab w:val="num" w:pos="2160"/>
+        </w:tabs>
+        <w:ind w:left="2160" w:hanging="360"/>
+      </w:pPr>
+      <w:rPr>
+        <w:rFonts w:ascii="Wingdings" w:hAnsi="Wingdings" w:hint="default"/>
+        <w:sz w:val="20"/>
+      </w:rPr>
+    </w:lvl>
+    <w:lvl w:ilvl="3" w:tentative="1">
+      <w:start w:val="1"/>
+      <w:numFmt w:val="bullet"/>
+      <w:lvlText w:val=""/>
+      <w:lvlJc w:val="left"/>
+      <w:pPr>
+        <w:tabs>
+          <w:tab w:val="num" w:pos="2880"/>
+        </w:tabs>
+        <w:ind w:left="2880" w:hanging="360"/>
+      </w:pPr>
+      <w:rPr>
+        <w:rFonts w:ascii="Wingdings" w:hAnsi="Wingdings" w:hint="default"/>
+        <w:sz w:val="20"/>
+      </w:rPr>
+    </w:lvl>
+    <w:lvl w:ilvl="4" w:tentative="1">
+      <w:start w:val="1"/>
+      <w:numFmt w:val="bullet"/>
+      <w:lvlText w:val=""/>
+      <w:lvlJc w:val="left"/>
+      <w:pPr>
+        <w:tabs>
+          <w:tab w:val="num" w:pos="3600"/>
+        </w:tabs>
+        <w:ind w:left="3600" w:hanging="360"/>
+      </w:pPr>
+      <w:rPr>
+        <w:rFonts w:ascii="Wingdings" w:hAnsi="Wingdings" w:hint="default"/>
+        <w:sz w:val="20"/>
+      </w:rPr>
+    </w:lvl>
+    <w:lvl w:ilvl="5" w:tentative="1">
+      <w:start w:val="1"/>
+      <w:numFmt w:val="bullet"/>
+      <w:lvlText w:val=""/>
+      <w:lvlJc w:val="left"/>
+      <w:pPr>
+        <w:tabs>
+          <w:tab w:val="num" w:pos="4320"/>
+        </w:tabs>
+        <w:ind w:left="4320" w:hanging="360"/>
+      </w:pPr>
+      <w:rPr>
+        <w:rFonts w:ascii="Wingdings" w:hAnsi="Wingdings" w:hint="default"/>
+        <w:sz w:val="20"/>
+      </w:rPr>
+    </w:lvl>
+    <w:lvl w:ilvl="6" w:tentative="1">
+      <w:start w:val="1"/>
+      <w:numFmt w:val="bullet"/>
+      <w:lvlText w:val=""/>
+      <w:lvlJc w:val="left"/>
+      <w:pPr>
+        <w:tabs>
+          <w:tab w:val="num" w:pos="5040"/>
+        </w:tabs>
+        <w:ind w:left="5040" w:hanging="360"/>
+      </w:pPr>
+      <w:rPr>
+        <w:rFonts w:ascii="Wingdings" w:hAnsi="Wingdings" w:hint="default"/>
+        <w:sz w:val="20"/>
+      </w:rPr>
+    </w:lvl>
+    <w:lvl w:ilvl="7" w:tentative="1">
+      <w:start w:val="1"/>
+      <w:numFmt w:val="bullet"/>
+      <w:lvlText w:val=""/>
+      <w:lvlJc w:val="left"/>
+      <w:pPr>
+        <w:tabs>
+          <w:tab w:val="num" w:pos="5760"/>
+        </w:tabs>
+        <w:ind w:left="5760" w:hanging="360"/>
+      </w:pPr>
+      <w:rPr>
+        <w:rFonts w:ascii="Wingdings" w:hAnsi="Wingdings" w:hint="default"/>
+        <w:sz w:val="20"/>
+      </w:rPr>
+    </w:lvl>
+    <w:lvl w:ilvl="8" w:tentative="1">
+      <w:start w:val="1"/>
+      <w:numFmt w:val="bullet"/>
+      <w:lvlText w:val=""/>
+      <w:lvlJc w:val="left"/>
+      <w:pPr>
+        <w:tabs>
+          <w:tab w:val="num" w:pos="6480"/>
+        </w:tabs>
+        <w:ind w:left="6480" w:hanging="360"/>
+      </w:pPr>
+      <w:rPr>
+        <w:rFonts w:ascii="Wingdings" w:hAnsi="Wingdings" w:hint="default"/>
+        <w:sz w:val="20"/>
+      </w:rPr>
+    </w:lvl>
+  </w:abstractNum>
+  <w:abstractNum w:abstractNumId="7" w15:restartNumberingAfterBreak="0">
     <w:nsid w:val="44E8499B"/>
     <w:multiLevelType w:val="multilevel"/>
     <w:tmpl w:val="F9AE4AE6"/>
@@ -7335,7 +7525,7 @@
       </w:rPr>
     </w:lvl>
   </w:abstractNum>
-  <w:abstractNum w:abstractNumId="7" w15:restartNumberingAfterBreak="0">
+  <w:abstractNum w:abstractNumId="8" w15:restartNumberingAfterBreak="0">
     <w:nsid w:val="4CC31999"/>
     <w:multiLevelType w:val="multilevel"/>
     <w:tmpl w:val="54B2BA4A"/>
@@ -7484,7 +7674,7 @@
       </w:rPr>
     </w:lvl>
   </w:abstractNum>
-  <w:abstractNum w:abstractNumId="8" w15:restartNumberingAfterBreak="0">
+  <w:abstractNum w:abstractNumId="9" w15:restartNumberingAfterBreak="0">
     <w:nsid w:val="4FC03295"/>
     <w:multiLevelType w:val="multilevel"/>
     <w:tmpl w:val="5B508340"/>
@@ -7633,7 +7823,7 @@
       </w:rPr>
     </w:lvl>
   </w:abstractNum>
-  <w:abstractNum w:abstractNumId="9" w15:restartNumberingAfterBreak="0">
+  <w:abstractNum w:abstractNumId="10" w15:restartNumberingAfterBreak="0">
     <w:nsid w:val="65385AB8"/>
     <w:multiLevelType w:val="singleLevel"/>
     <w:tmpl w:val="65385AB8"/>
@@ -7649,16 +7839,16 @@
     <w:abstractNumId w:val="1"/>
   </w:num>
   <w:num w:numId="2" w16cid:durableId="1553690338">
-    <w:abstractNumId w:val="8"/>
+    <w:abstractNumId w:val="9"/>
   </w:num>
   <w:num w:numId="3" w16cid:durableId="1504081841">
-    <w:abstractNumId w:val="6"/>
+    <w:abstractNumId w:val="7"/>
   </w:num>
   <w:num w:numId="4" w16cid:durableId="1814248704">
     <w:abstractNumId w:val="5"/>
   </w:num>
   <w:num w:numId="5" w16cid:durableId="201946431">
-    <w:abstractNumId w:val="7"/>
+    <w:abstractNumId w:val="8"/>
   </w:num>
   <w:num w:numId="6" w16cid:durableId="95441372">
     <w:abstractNumId w:val="2"/>
@@ -7673,10 +7863,13 @@
     </w:lvlOverride>
   </w:num>
   <w:num w:numId="9" w16cid:durableId="82188157">
-    <w:abstractNumId w:val="9"/>
+    <w:abstractNumId w:val="10"/>
   </w:num>
   <w:num w:numId="10" w16cid:durableId="2104833871">
     <w:abstractNumId w:val="3"/>
+  </w:num>
+  <w:num w:numId="11" w16cid:durableId="1435125260">
+    <w:abstractNumId w:val="6"/>
   </w:num>
 </w:numbering>
 </file>

</xml_diff>